<commit_message>
created end level powerplay data
</commit_message>
<xml_diff>
--- a/notes.docx
+++ b/notes.docx
@@ -11,19 +11,7 @@
           <w:rPr>
             <w:rStyle w:val="Hyperlink"/>
           </w:rPr>
-          <w:t>https://statds.org/events/csas2026/chal</w:t>
-        </w:r>
-        <w:r>
-          <w:rPr>
-            <w:rStyle w:val="Hyperlink"/>
-          </w:rPr>
-          <w:t>l</w:t>
-        </w:r>
-        <w:r>
-          <w:rPr>
-            <w:rStyle w:val="Hyperlink"/>
-          </w:rPr>
-          <w:t>enge.html</w:t>
+          <w:t>https://statds.org/events/csas2026/challenge.html</w:t>
         </w:r>
       </w:hyperlink>
       <w:r>
@@ -1036,6 +1024,143 @@
     </w:p>
     <w:p>
       <w:pPr>
+        <w:spacing w:before="100" w:beforeAutospacing="1" w:after="100" w:afterAutospacing="1" w:line="240" w:lineRule="auto"/>
+        <w:rPr>
+          <w:rFonts w:ascii="Times New Roman" w:eastAsia="Times New Roman" w:hAnsi="Times New Roman" w:cs="Times New Roman"/>
+          <w:color w:val="000000"/>
+          <w:kern w:val="0"/>
+          <w14:ligatures w14:val="none"/>
+        </w:rPr>
+      </w:pPr>
+      <w:r>
+        <w:rPr>
+          <w:rFonts w:ascii="Times New Roman" w:eastAsia="Times New Roman" w:hAnsi="Times New Roman" w:cs="Times New Roman"/>
+          <w:color w:val="000000"/>
+          <w:kern w:val="0"/>
+          <w14:ligatures w14:val="none"/>
+        </w:rPr>
+        <w:t>I still need to merge. I need to focus on getting:</w:t>
+      </w:r>
+    </w:p>
+    <w:p>
+      <w:pPr>
+        <w:pStyle w:val="ListParagraph"/>
+        <w:numPr>
+          <w:ilvl w:val="0"/>
+          <w:numId w:val="17"/>
+        </w:numPr>
+        <w:spacing w:before="100" w:beforeAutospacing="1" w:after="100" w:afterAutospacing="1" w:line="240" w:lineRule="auto"/>
+        <w:rPr>
+          <w:rFonts w:ascii="Times New Roman" w:eastAsia="Times New Roman" w:hAnsi="Times New Roman" w:cs="Times New Roman"/>
+          <w:color w:val="000000"/>
+          <w:kern w:val="0"/>
+          <w14:ligatures w14:val="none"/>
+        </w:rPr>
+      </w:pPr>
+      <w:r>
+        <w:rPr>
+          <w:rFonts w:ascii="Times New Roman" w:eastAsia="Times New Roman" w:hAnsi="Times New Roman" w:cs="Times New Roman"/>
+          <w:color w:val="000000"/>
+          <w:kern w:val="0"/>
+          <w14:ligatures w14:val="none"/>
+        </w:rPr>
+        <w:lastRenderedPageBreak/>
+        <w:t xml:space="preserve">the power-play variable </w:t>
+      </w:r>
+    </w:p>
+    <w:p>
+      <w:pPr>
+        <w:pStyle w:val="ListParagraph"/>
+        <w:numPr>
+          <w:ilvl w:val="0"/>
+          <w:numId w:val="17"/>
+        </w:numPr>
+        <w:spacing w:before="100" w:beforeAutospacing="1" w:after="100" w:afterAutospacing="1" w:line="240" w:lineRule="auto"/>
+        <w:rPr>
+          <w:rFonts w:ascii="Times New Roman" w:eastAsia="Times New Roman" w:hAnsi="Times New Roman" w:cs="Times New Roman"/>
+          <w:color w:val="000000"/>
+          <w:kern w:val="0"/>
+          <w14:ligatures w14:val="none"/>
+        </w:rPr>
+      </w:pPr>
+      <w:r>
+        <w:rPr>
+          <w:rFonts w:ascii="Times New Roman" w:eastAsia="Times New Roman" w:hAnsi="Times New Roman" w:cs="Times New Roman"/>
+          <w:color w:val="000000"/>
+          <w:kern w:val="0"/>
+          <w14:ligatures w14:val="none"/>
+        </w:rPr>
+        <w:t>points conceded in the end variable</w:t>
+      </w:r>
+    </w:p>
+    <w:p>
+      <w:pPr>
+        <w:pStyle w:val="ListParagraph"/>
+        <w:numPr>
+          <w:ilvl w:val="0"/>
+          <w:numId w:val="17"/>
+        </w:numPr>
+        <w:spacing w:before="100" w:beforeAutospacing="1" w:after="100" w:afterAutospacing="1" w:line="240" w:lineRule="auto"/>
+        <w:rPr>
+          <w:rFonts w:ascii="Times New Roman" w:eastAsia="Times New Roman" w:hAnsi="Times New Roman" w:cs="Times New Roman"/>
+          <w:color w:val="000000"/>
+          <w:kern w:val="0"/>
+          <w14:ligatures w14:val="none"/>
+        </w:rPr>
+      </w:pPr>
+      <w:r>
+        <w:rPr>
+          <w:rFonts w:ascii="Times New Roman" w:eastAsia="Times New Roman" w:hAnsi="Times New Roman" w:cs="Times New Roman"/>
+          <w:color w:val="000000"/>
+          <w:kern w:val="0"/>
+          <w14:ligatures w14:val="none"/>
+        </w:rPr>
+        <w:t>binanry outcome variables. These will be helpful for story telling such as gave_up_2_plus, gave_up_3_plus, force_1_or_less, etc…</w:t>
+      </w:r>
+    </w:p>
+    <w:p>
+      <w:pPr>
+        <w:pStyle w:val="ListParagraph"/>
+        <w:numPr>
+          <w:ilvl w:val="0"/>
+          <w:numId w:val="17"/>
+        </w:numPr>
+        <w:spacing w:before="100" w:beforeAutospacing="1" w:after="100" w:afterAutospacing="1" w:line="240" w:lineRule="auto"/>
+        <w:rPr>
+          <w:rFonts w:ascii="Times New Roman" w:eastAsia="Times New Roman" w:hAnsi="Times New Roman" w:cs="Times New Roman"/>
+          <w:color w:val="000000"/>
+          <w:kern w:val="0"/>
+          <w14:ligatures w14:val="none"/>
+        </w:rPr>
+      </w:pPr>
+      <w:r>
+        <w:rPr>
+          <w:rFonts w:ascii="Times New Roman" w:eastAsia="Times New Roman" w:hAnsi="Times New Roman" w:cs="Times New Roman"/>
+          <w:color w:val="000000"/>
+          <w:kern w:val="0"/>
+          <w14:ligatures w14:val="none"/>
+        </w:rPr>
+        <w:t>end level shot quality summery of the first 2 shots using points. The idea is to see if positioning is only effective when executed well. I can think about the mean of the 2 shots or I can think about the min of the 2 shots like a mistake indicator. This will help avoid blaming strategies for execution failure.</w:t>
+      </w:r>
+    </w:p>
+    <w:p>
+      <w:pPr>
+        <w:pStyle w:val="ListParagraph"/>
+        <w:numPr>
+          <w:ilvl w:val="0"/>
+          <w:numId w:val="17"/>
+        </w:numPr>
+        <w:spacing w:before="100" w:beforeAutospacing="1" w:after="100" w:afterAutospacing="1" w:line="240" w:lineRule="auto"/>
+        <w:rPr>
+          <w:rFonts w:ascii="Times New Roman" w:eastAsia="Times New Roman" w:hAnsi="Times New Roman" w:cs="Times New Roman"/>
+          <w:color w:val="000000"/>
+          <w:kern w:val="0"/>
+          <w14:ligatures w14:val="none"/>
+        </w:rPr>
+      </w:pPr>
+    </w:p>
+    <w:p>
+      <w:pPr>
         <w:rPr>
           <w:rFonts w:ascii="Roboto" w:hAnsi="Roboto"/>
           <w:color w:val="202225"/>
@@ -2413,7 +2538,7 @@
           <w:noProof/>
           <w:kern w:val="0"/>
         </w:rPr>
-        <w:pict w14:anchorId="3B6C408A">
+        <w:pict w14:anchorId="1A187243">
           <v:rect id="_x0000_i1025" alt="" style="width:468pt;height:.05pt;mso-width-percent:0;mso-height-percent:0;mso-width-percent:0;mso-height-percent:0" o:hralign="center" o:hrstd="t" o:hr="t" fillcolor="#a0a0a0" stroked="f"/>
         </w:pict>
       </w:r>
@@ -4122,6 +4247,119 @@
     </w:lvl>
   </w:abstractNum>
   <w:abstractNum w:abstractNumId="10" w15:restartNumberingAfterBreak="0">
+    <w:nsid w:val="51014C32"/>
+    <w:multiLevelType w:val="hybridMultilevel"/>
+    <w:tmpl w:val="C6C65050"/>
+    <w:lvl w:ilvl="0" w:tplc="04090001">
+      <w:start w:val="1"/>
+      <w:numFmt w:val="bullet"/>
+      <w:lvlText w:val=""/>
+      <w:lvlJc w:val="left"/>
+      <w:pPr>
+        <w:ind w:left="784" w:hanging="360"/>
+      </w:pPr>
+      <w:rPr>
+        <w:rFonts w:ascii="Symbol" w:hAnsi="Symbol" w:hint="default"/>
+      </w:rPr>
+    </w:lvl>
+    <w:lvl w:ilvl="1" w:tplc="04090003" w:tentative="1">
+      <w:start w:val="1"/>
+      <w:numFmt w:val="bullet"/>
+      <w:lvlText w:val="o"/>
+      <w:lvlJc w:val="left"/>
+      <w:pPr>
+        <w:ind w:left="1504" w:hanging="360"/>
+      </w:pPr>
+      <w:rPr>
+        <w:rFonts w:ascii="Courier New" w:hAnsi="Courier New" w:cs="Courier New" w:hint="default"/>
+      </w:rPr>
+    </w:lvl>
+    <w:lvl w:ilvl="2" w:tplc="04090005" w:tentative="1">
+      <w:start w:val="1"/>
+      <w:numFmt w:val="bullet"/>
+      <w:lvlText w:val=""/>
+      <w:lvlJc w:val="left"/>
+      <w:pPr>
+        <w:ind w:left="2224" w:hanging="360"/>
+      </w:pPr>
+      <w:rPr>
+        <w:rFonts w:ascii="Wingdings" w:hAnsi="Wingdings" w:hint="default"/>
+      </w:rPr>
+    </w:lvl>
+    <w:lvl w:ilvl="3" w:tplc="04090001" w:tentative="1">
+      <w:start w:val="1"/>
+      <w:numFmt w:val="bullet"/>
+      <w:lvlText w:val=""/>
+      <w:lvlJc w:val="left"/>
+      <w:pPr>
+        <w:ind w:left="2944" w:hanging="360"/>
+      </w:pPr>
+      <w:rPr>
+        <w:rFonts w:ascii="Symbol" w:hAnsi="Symbol" w:hint="default"/>
+      </w:rPr>
+    </w:lvl>
+    <w:lvl w:ilvl="4" w:tplc="04090003" w:tentative="1">
+      <w:start w:val="1"/>
+      <w:numFmt w:val="bullet"/>
+      <w:lvlText w:val="o"/>
+      <w:lvlJc w:val="left"/>
+      <w:pPr>
+        <w:ind w:left="3664" w:hanging="360"/>
+      </w:pPr>
+      <w:rPr>
+        <w:rFonts w:ascii="Courier New" w:hAnsi="Courier New" w:cs="Courier New" w:hint="default"/>
+      </w:rPr>
+    </w:lvl>
+    <w:lvl w:ilvl="5" w:tplc="04090005" w:tentative="1">
+      <w:start w:val="1"/>
+      <w:numFmt w:val="bullet"/>
+      <w:lvlText w:val=""/>
+      <w:lvlJc w:val="left"/>
+      <w:pPr>
+        <w:ind w:left="4384" w:hanging="360"/>
+      </w:pPr>
+      <w:rPr>
+        <w:rFonts w:ascii="Wingdings" w:hAnsi="Wingdings" w:hint="default"/>
+      </w:rPr>
+    </w:lvl>
+    <w:lvl w:ilvl="6" w:tplc="04090001" w:tentative="1">
+      <w:start w:val="1"/>
+      <w:numFmt w:val="bullet"/>
+      <w:lvlText w:val=""/>
+      <w:lvlJc w:val="left"/>
+      <w:pPr>
+        <w:ind w:left="5104" w:hanging="360"/>
+      </w:pPr>
+      <w:rPr>
+        <w:rFonts w:ascii="Symbol" w:hAnsi="Symbol" w:hint="default"/>
+      </w:rPr>
+    </w:lvl>
+    <w:lvl w:ilvl="7" w:tplc="04090003" w:tentative="1">
+      <w:start w:val="1"/>
+      <w:numFmt w:val="bullet"/>
+      <w:lvlText w:val="o"/>
+      <w:lvlJc w:val="left"/>
+      <w:pPr>
+        <w:ind w:left="5824" w:hanging="360"/>
+      </w:pPr>
+      <w:rPr>
+        <w:rFonts w:ascii="Courier New" w:hAnsi="Courier New" w:cs="Courier New" w:hint="default"/>
+      </w:rPr>
+    </w:lvl>
+    <w:lvl w:ilvl="8" w:tplc="04090005" w:tentative="1">
+      <w:start w:val="1"/>
+      <w:numFmt w:val="bullet"/>
+      <w:lvlText w:val=""/>
+      <w:lvlJc w:val="left"/>
+      <w:pPr>
+        <w:ind w:left="6544" w:hanging="360"/>
+      </w:pPr>
+      <w:rPr>
+        <w:rFonts w:ascii="Wingdings" w:hAnsi="Wingdings" w:hint="default"/>
+      </w:rPr>
+    </w:lvl>
+  </w:abstractNum>
+  <w:abstractNum w:abstractNumId="11" w15:restartNumberingAfterBreak="0">
     <w:nsid w:val="544B01C6"/>
     <w:multiLevelType w:val="multilevel"/>
     <w:tmpl w:val="6D6EB064"/>
@@ -4270,7 +4508,7 @@
       </w:rPr>
     </w:lvl>
   </w:abstractNum>
-  <w:abstractNum w:abstractNumId="11" w15:restartNumberingAfterBreak="0">
+  <w:abstractNum w:abstractNumId="12" w15:restartNumberingAfterBreak="0">
     <w:nsid w:val="57D145CB"/>
     <w:multiLevelType w:val="hybridMultilevel"/>
     <w:tmpl w:val="81F64778"/>
@@ -4383,7 +4621,7 @@
       </w:rPr>
     </w:lvl>
   </w:abstractNum>
-  <w:abstractNum w:abstractNumId="12" w15:restartNumberingAfterBreak="0">
+  <w:abstractNum w:abstractNumId="13" w15:restartNumberingAfterBreak="0">
     <w:nsid w:val="6A076C10"/>
     <w:multiLevelType w:val="multilevel"/>
     <w:tmpl w:val="ED3CDB0E"/>
@@ -4532,7 +4770,7 @@
       </w:rPr>
     </w:lvl>
   </w:abstractNum>
-  <w:abstractNum w:abstractNumId="13" w15:restartNumberingAfterBreak="0">
+  <w:abstractNum w:abstractNumId="14" w15:restartNumberingAfterBreak="0">
     <w:nsid w:val="6A4935A0"/>
     <w:multiLevelType w:val="multilevel"/>
     <w:tmpl w:val="0F26A0AA"/>
@@ -4681,7 +4919,7 @@
       </w:rPr>
     </w:lvl>
   </w:abstractNum>
-  <w:abstractNum w:abstractNumId="14" w15:restartNumberingAfterBreak="0">
+  <w:abstractNum w:abstractNumId="15" w15:restartNumberingAfterBreak="0">
     <w:nsid w:val="6C3F6BBF"/>
     <w:multiLevelType w:val="multilevel"/>
     <w:tmpl w:val="AC36FE3A"/>
@@ -4830,7 +5068,7 @@
       </w:rPr>
     </w:lvl>
   </w:abstractNum>
-  <w:abstractNum w:abstractNumId="15" w15:restartNumberingAfterBreak="0">
+  <w:abstractNum w:abstractNumId="16" w15:restartNumberingAfterBreak="0">
     <w:nsid w:val="79A87681"/>
     <w:multiLevelType w:val="hybridMultilevel"/>
     <w:tmpl w:val="2F880372"/>
@@ -4917,10 +5155,10 @@
     </w:lvl>
   </w:abstractNum>
   <w:num w:numId="1" w16cid:durableId="407846597">
-    <w:abstractNumId w:val="12"/>
+    <w:abstractNumId w:val="13"/>
   </w:num>
   <w:num w:numId="2" w16cid:durableId="826090324">
-    <w:abstractNumId w:val="10"/>
+    <w:abstractNumId w:val="11"/>
   </w:num>
   <w:num w:numId="3" w16cid:durableId="474682756">
     <w:abstractNumId w:val="1"/>
@@ -4935,22 +5173,22 @@
     <w:abstractNumId w:val="9"/>
   </w:num>
   <w:num w:numId="7" w16cid:durableId="221138203">
-    <w:abstractNumId w:val="11"/>
+    <w:abstractNumId w:val="12"/>
   </w:num>
   <w:num w:numId="8" w16cid:durableId="488904237">
-    <w:abstractNumId w:val="15"/>
+    <w:abstractNumId w:val="16"/>
   </w:num>
   <w:num w:numId="9" w16cid:durableId="1319112123">
     <w:abstractNumId w:val="3"/>
   </w:num>
   <w:num w:numId="10" w16cid:durableId="308443077">
-    <w:abstractNumId w:val="13"/>
+    <w:abstractNumId w:val="14"/>
   </w:num>
   <w:num w:numId="11" w16cid:durableId="1453671505">
     <w:abstractNumId w:val="2"/>
   </w:num>
   <w:num w:numId="12" w16cid:durableId="1343321360">
-    <w:abstractNumId w:val="14"/>
+    <w:abstractNumId w:val="15"/>
   </w:num>
   <w:num w:numId="13" w16cid:durableId="805011309">
     <w:abstractNumId w:val="8"/>
@@ -4963,6 +5201,9 @@
   </w:num>
   <w:num w:numId="16" w16cid:durableId="1298955158">
     <w:abstractNumId w:val="4"/>
+  </w:num>
+  <w:num w:numId="17" w16cid:durableId="2000234947">
+    <w:abstractNumId w:val="10"/>
   </w:num>
 </w:numbering>
 </file>

</xml_diff>